<commit_message>
Restructure the 2-page writeup around the official submission rubric
Explicit sections for motivation, chosen problem, architecture,
assumptions, what worked, what failed, and next steps, replacing the
earlier results-pitch framing.

Co-Authored-By: Claude Sonnet 5 <noreply@anthropic.com>
</commit_message>
<xml_diff>
--- a/SOTA_Commission_II_Submission.docx
+++ b/SOTA_Commission_II_Submission.docx
@@ -43,24 +43,38 @@
     </w:p>
     <w:p>
       <w:pPr>
-        <w:spacing w:after="160"/>
+        <w:spacing w:after="120"/>
       </w:pPr>
       <w:r>
-        <w:t>Remote, off-grid plants that convert solar electricity into a storable fuel, here synthetic methane via Sabatier synthesis, run into an intermittency problem that conventional battery (BESS) controllers do not account for. A Sabatier reactor's methanation reaction sustains itself once hot, but if its trickle-heating supply is cut off for long enough during a low-irradiance stretch, its temperature drifts below the minimum operating threshold. Restarting it then costs 4–6 hours of dedicated, high-power rehea</w:t>
+        <w:t>Remote, off-grid plants that convert solar electricity into a storable fuel, here synthetic methane via Sabatier synthesis, run into an intermittency problem that conventional battery (BESS) controllers do not account for: a controller that only tracks the electrical balance treats every kilowatt-hour the same, whether it idles an electrolyzer that can restart instantly or lets the reactor go cold, which then costs 4–6 hours of dedicated reheating before production can resume. This is the Intermittent Abund</w:t>
       </w:r>
       <w:r>
-        <w:t>ting, time that comes directly out of production. A controller that only tracks the electrical balance treats every kilowatt-hour the same, whether it idles an electrolyzer that can restart instantly or lets the reactor go cold. This is the Intermittent Abundance problem in miniature: solar energy is abundant on average, but a process built on it is only as reliable as its ability to survive the gaps.</w:t>
+        <w:t>ance problem in miniature: solar energy is abundant on average, but a process built on it is only as reliable as its ability to survive the gaps.</w:t>
       </w:r>
     </w:p>
     <w:p>
       <w:pPr>
-        <w:spacing w:after="160"/>
+        <w:spacing w:after="120"/>
       </w:pPr>
       <w:r>
-        <w:t xml:space="preserve">An earlier prototype of this project tested whether a forecast-driven, proactive battery-reservation strategy, reserving capacity for the reactor before a shortfall arrives instead of reacting once it hits, actually helps. In a Mediterranean climate, it eliminated reactor cold-starts entirely. That raised the real question behind this submission: which of the many possible designs for such a strategy actually works? A fixed reserve, a forecast-triggered switch, a severity-scaled reserve, a reserve computed </w:t>
+        <w:t>An earlier prototype tested whether proactively reserving battery capacity ahead of a forecasted shortfall helps at all: it does, eliminating reactor cold-starts entirely in a Mediterranean climate. That raised the actual problem this project tackles: proactive reservation spans a whole design space of plausible mechanisms, a fixed reserve, a forecast-triggered switch, a severity-scaled reserve, a physics-based reserve, eager pre-charging, and full trajectory projection, and it was not obvious which is wort</w:t>
       </w:r>
       <w:r>
-        <w:t>from reactor thermodynamics, an eager pre-charging approach, and a full rolling-horizon trajectory projection are six different answers. I built and compared all of them, plus the conventional reactive baseline, on identical infrastructure.</w:t>
+        <w:t>h building, or where. I built all seven strategies (these six plus the conventional reactive baseline) and compared them systematically across three climates and four forecast-error levels.</w:t>
+      </w:r>
+    </w:p>
+    <w:p>
+      <w:pPr>
+        <w:spacing w:after="120"/>
+      </w:pPr>
+      <w:r>
+        <w:rPr>
+          <w:b/>
+        </w:rPr>
+        <w:t xml:space="preserve">Architecture. </w:t>
+      </w:r>
+      <w:r>
+        <w:t>All seven strategies share one hourly digital twin, a physically modelled PV array, battery, a four-state Newtonian Sabatier-reactor thermal model, electrolyzer, DAC unit, and a hard-limit RTU protection layer, plus one common software interface (a shared strategy base class), so only the control logic changes between runs, never the underlying plant or simulation loop.</w:t>
       </w:r>
     </w:p>
     <w:p>
@@ -68,7 +82,13 @@
         <w:spacing w:after="80"/>
       </w:pPr>
       <w:r>
-        <w:t>All seven strategies run on the same hourly digital twin: a physically modelled PV array, battery, Sabatier reactor (a four-state Newtonian thermal model), electrolyzer, DAC unit, and a hard-limit RTU layer. Only the control logic changes between runs.</w:t>
+        <w:rPr>
+          <w:b/>
+        </w:rPr>
+        <w:t xml:space="preserve">Assumptions. </w:t>
+      </w:r>
+      <w:r>
+        <w:t>The Sabatier cooling model omits the reaction's own exothermic heat (a conservative simplification; real reactors cool somewhat more slowly); the battery model excludes long-term degradation; forecast error is modelled as additive Gaussian noise rather than the time-correlated, often-asymmetric error of real weather forecasts; and the RTU layer is a generic hard-limit abstraction, not a specific real device's configuration.</w:t>
       </w:r>
     </w:p>
     <w:p>
@@ -96,8 +116,9 @@
         <w:rPr>
           <w:noProof/>
         </w:rPr>
+        <w:lastRenderedPageBreak/>
         <w:drawing>
-          <wp:inline distT="0" distB="0" distL="0" distR="0" wp14:anchorId="09411636" wp14:editId="20FDC19A">
+          <wp:inline distT="0" distB="0" distL="0" distR="0" wp14:anchorId="3906211E" wp14:editId="3B31555D">
             <wp:extent cx="5760720" cy="2099373"/>
             <wp:effectExtent l="0" t="0" r="0" b="0"/>
             <wp:docPr id="1" name="Picture 1"/>
@@ -142,7 +163,6 @@
           <w:i/>
           <w:sz w:val="18"/>
         </w:rPr>
-        <w:lastRenderedPageBreak/>
         <w:t>Figure 1. Annual cold-start count by strategy, per site, under perfect forecast. Ouarzazate stays at zero for every strategy, including the baseline: its desert climate never produces a shortfall severe enough to matter, so it is a control case rather than one where strategy choice matters. Strategies 6 (Precharge) and 7 (Rolling Horizon) are the only ones to fully eliminate cold-starts in Seville; none fully eliminates them in Edinburgh's harsher climate.</w:t>
       </w:r>
     </w:p>
@@ -846,79 +866,19 @@
     </w:p>
     <w:p>
       <w:pPr>
-        <w:spacing w:after="80"/>
-      </w:pPr>
-      <w:r>
-        <w:t>Complexity turned out to be a poor predictor of effectiveness. Under a perfect forecast, the simplest eager strategy (Precharge, which pre-charges the battery the moment a cloudy stretch is forecast, without computing a deficit at all) outperforms the most computationally sophisticated one (Rolling Horizon, which re-projects the full battery trajectory every hour) in Edinburgh: 66 cold-starts a year versus 100.</w:t>
-      </w:r>
-    </w:p>
-    <w:p>
-      <w:pPr>
-        <w:spacing w:after="40"/>
-        <w:jc w:val="center"/>
+        <w:spacing w:after="120"/>
       </w:pPr>
       <w:r>
         <w:rPr>
-          <w:noProof/>
+          <w:b/>
         </w:rPr>
-        <w:drawing>
-          <wp:inline distT="0" distB="0" distL="0" distR="0" wp14:anchorId="41F8FC53" wp14:editId="07F4CBA8">
-            <wp:extent cx="1920240" cy="1440180"/>
-            <wp:effectExtent l="0" t="0" r="0" b="0"/>
-            <wp:docPr id="2" name="Picture 2"/>
-            <wp:cNvGraphicFramePr>
-              <a:graphicFrameLocks xmlns:a="http://schemas.openxmlformats.org/drawingml/2006/main" noChangeAspect="1"/>
-            </wp:cNvGraphicFramePr>
-            <a:graphic xmlns:a="http://schemas.openxmlformats.org/drawingml/2006/main">
-              <a:graphicData uri="http://schemas.openxmlformats.org/drawingml/2006/picture">
-                <pic:pic xmlns:pic="http://schemas.openxmlformats.org/drawingml/2006/picture">
-                  <pic:nvPicPr>
-                    <pic:cNvPr id="0" name="fig2_robustness.png"/>
-                    <pic:cNvPicPr/>
-                  </pic:nvPicPr>
-                  <pic:blipFill>
-                    <a:blip r:embed="rId7"/>
-                    <a:stretch>
-                      <a:fillRect/>
-                    </a:stretch>
-                  </pic:blipFill>
-                  <pic:spPr>
-                    <a:xfrm>
-                      <a:off x="0" y="0"/>
-                      <a:ext cx="1920240" cy="1440180"/>
-                    </a:xfrm>
-                    <a:prstGeom prst="rect">
-                      <a:avLst/>
-                    </a:prstGeom>
-                  </pic:spPr>
-                </pic:pic>
-              </a:graphicData>
-            </a:graphic>
-          </wp:inline>
-        </w:drawing>
-      </w:r>
-    </w:p>
-    <w:p>
-      <w:pPr>
-        <w:spacing w:after="160"/>
-      </w:pPr>
-      <w:r>
-        <w:rPr>
-          <w:i/>
-          <w:sz w:val="18"/>
-        </w:rPr>
-        <w:t>Figure 2. Cold-starts per year in Edinburgh as injected forecast error grows, one line per strategy. Precharge's advantage erodes fastest; Rolling Horizon degrades more gradually and overtakes it once forecast error passes roughly 10-20%.</w:t>
-      </w:r>
-    </w:p>
-    <w:p>
-      <w:pPr>
-        <w:spacing w:after="160"/>
-      </w:pPr>
-      <w:r>
-        <w:t>That reversal is the point: a ranking under a perfect forecast need not survive realistic forecast uncertainty. A third strategy, reserve sized from reactor thermodynamics using Newton's law of cooling, looks like the most physically principled approach but performs no better than doing nothing: the reactor's own maintenance-mode logic keeps it pinned at its minimum temperature within about two hours of every night, leaving the formula almost nothing to compute. A sizing formula does not help if its trigger</w:t>
+        <w:t xml:space="preserve">What worked. </w:t>
       </w:r>
       <w:r>
-        <w:t xml:space="preserve"> never sees the risk in time.</w:t>
+        <w:t>Precharge and Rolling Horizon fully eliminate cold-starts in Seville, but complexity does not predict effectiveness: under a perfect forecast, the simplest eager strategy (Precharge) beats the most computationally expensive one (Rolling Horizon) in Edinburgh, 66 cold-starts a year versus 100, yet that ranking reverses as forecast error grows, Precharge's advantage erodes fast while Rolling Horizon degrades gracefully and overtakes it past roughly 10–20% forecast error. No strategy reaches zero in Edinburgh;</w:t>
+      </w:r>
+      <w:r>
+        <w:t xml:space="preserve"> a 2,000 kWh battery is undersized for that climate's worst multi-day deficit, a limit the simulation makes visible rather than assumed.</w:t>
       </w:r>
     </w:p>
     <w:p>
@@ -926,31 +886,16 @@
         <w:spacing w:after="120"/>
       </w:pPr>
       <w:r>
-        <w:t>The answer to “which life-insurance strategy is worth its complexity” depends on climate and on how much you trust your forecast, and this project turns that into something I can compute instead of guess at: a simulation framework that, for a given site and forecast quality, points to which of the seven strategies to deploy.</w:t>
+        <w:rPr>
+          <w:b/>
+        </w:rPr>
+        <w:t xml:space="preserve">What failed. </w:t>
       </w:r>
-    </w:p>
-    <w:p>
-      <w:pPr>
-        <w:pStyle w:val="ListBullet"/>
-      </w:pPr>
       <w:r>
-        <w:t>A tested seven-strategy comparison framework (84 full-year runs, sub-minute runtime), reusable for any new site or strategy.</w:t>
+        <w:t>Two designs failed outright before the final architecture worked. Letting the electrolyzer/DAC draw partially from the battery above a reserve floor caused a catastrophic regression (300+ cold-starts a year, worse than doing nothing at all), because a single winter night's reactor-protection need (~760 kWh) already exceeds the largest reserve tested (800 kWh); the final design gives industrial loads PV-surplus only, with the reserve instead controlling a full on/off cutoff. Separately, the Temperature-Based</w:t>
       </w:r>
-    </w:p>
-    <w:p>
-      <w:pPr>
-        <w:pStyle w:val="ListBullet"/>
-      </w:pPr>
       <w:r>
-        <w:t>A non-obvious finding: reserve-trigger design matters more than reserve-sizing sophistication, including a case where the more “principled” formula underperforms due to a subtle interaction with the plant's own thermal-maintenance design.</w:t>
-      </w:r>
-    </w:p>
-    <w:p>
-      <w:pPr>
-        <w:pStyle w:val="ListBullet"/>
-      </w:pPr>
-      <w:r>
-        <w:t>Evidence that the right strategy depends on site and forecast quality, not on a universal rule, visible only through systematic simulation rather than a single hand-picked comparison.</w:t>
+        <w:t xml:space="preserve"> strategy's reserve formula was implemented backwards during development (larger reserve when the reactor was hottest, none when it was coldest); corrected, it still performs no better than doing nothing, since the reactor's own maintenance logic pins it at minimum temperature within about two hours of every night, leaving the formula almost nothing to compute by the time it would matter.</w:t>
       </w:r>
     </w:p>
     <w:p>
@@ -958,7 +903,13 @@
         <w:spacing w:after="0"/>
       </w:pPr>
       <w:r>
-        <w:t>Together, these results turn “add a battery for insurance” into an answerable design question: which mechanism, sized how, for which climate.</w:t>
+        <w:rPr>
+          <w:b/>
+        </w:rPr>
+        <w:t xml:space="preserve">Next. </w:t>
+      </w:r>
+      <w:r>
+        <w:t>Replace this study's perfect-hindsight forecast with a live weather feed; test hybrid designs, for instance a thermodynamic trigger paired with a rolling-horizon projection, that no single strategy tested here covers alone; and couple the reactor's thermal state to an explicit H2/CO2 mass balance for a fully closed-loop chemical-yield model.</w:t>
       </w:r>
     </w:p>
     <w:sectPr>
@@ -1144,31 +1095,31 @@
       </w:rPr>
     </w:lvl>
   </w:abstractNum>
-  <w:num w:numId="1" w16cid:durableId="2080129496">
+  <w:num w:numId="1" w16cid:durableId="551188332">
     <w:abstractNumId w:val="8"/>
   </w:num>
-  <w:num w:numId="2" w16cid:durableId="2144418443">
+  <w:num w:numId="2" w16cid:durableId="210117003">
     <w:abstractNumId w:val="6"/>
   </w:num>
-  <w:num w:numId="3" w16cid:durableId="600140719">
+  <w:num w:numId="3" w16cid:durableId="39982743">
     <w:abstractNumId w:val="5"/>
   </w:num>
-  <w:num w:numId="4" w16cid:durableId="1373461434">
+  <w:num w:numId="4" w16cid:durableId="527915550">
     <w:abstractNumId w:val="4"/>
   </w:num>
-  <w:num w:numId="5" w16cid:durableId="76027823">
+  <w:num w:numId="5" w16cid:durableId="602765864">
     <w:abstractNumId w:val="7"/>
   </w:num>
-  <w:num w:numId="6" w16cid:durableId="1200244637">
+  <w:num w:numId="6" w16cid:durableId="58556340">
     <w:abstractNumId w:val="3"/>
   </w:num>
-  <w:num w:numId="7" w16cid:durableId="2110272065">
+  <w:num w:numId="7" w16cid:durableId="832381894">
     <w:abstractNumId w:val="2"/>
   </w:num>
-  <w:num w:numId="8" w16cid:durableId="1694574445">
+  <w:num w:numId="8" w16cid:durableId="242760799">
     <w:abstractNumId w:val="1"/>
   </w:num>
-  <w:num w:numId="9" w16cid:durableId="648747710">
+  <w:num w:numId="9" w16cid:durableId="1388845335">
     <w:abstractNumId w:val="0"/>
   </w:num>
 </w:numbering>

</xml_diff>

<commit_message>
Fix misleading forecast-error framing in the next-steps section
The docx and slide deck implied the study never tested imperfect
forecasts. It did (Gaussian noise, 4 levels, across all 84 runs) -- the
real gap is synthetic independent noise vs. a live feed's correlated,
biased error.

Co-Authored-By: Claude Sonnet 5 <noreply@anthropic.com>
</commit_message>
<xml_diff>
--- a/SOTA_Commission_II_Submission.docx
+++ b/SOTA_Commission_II_Submission.docx
@@ -118,7 +118,7 @@
         </w:rPr>
         <w:lastRenderedPageBreak/>
         <w:drawing>
-          <wp:inline distT="0" distB="0" distL="0" distR="0" wp14:anchorId="3906211E" wp14:editId="3B31555D">
+          <wp:inline distT="0" distB="0" distL="0" distR="0" wp14:anchorId="6DCFB157" wp14:editId="53D34353">
             <wp:extent cx="5760720" cy="2099373"/>
             <wp:effectExtent l="0" t="0" r="0" b="0"/>
             <wp:docPr id="1" name="Picture 1"/>
@@ -909,7 +909,10 @@
         <w:t xml:space="preserve">Next. </w:t>
       </w:r>
       <w:r>
-        <w:t>Replace this study's perfect-hindsight forecast with a live weather feed; test hybrid designs, for instance a thermodynamic trigger paired with a rolling-horizon projection, that no single strategy tested here covers alone; and couple the reactor's thermal state to an explicit H2/CO2 mass balance for a fully closed-loop chemical-yield model.</w:t>
+        <w:t>All 84 runs already cover imperfect forecasts, but as synthetic, independent Gaussian noise; replacing that with a live weather feed, whose errors are time-correlated and often biased in ways white noise isn't, would test whether the same strategy rankings hold. Also worth testing: hybrid designs, for instance a thermodynamic trigger paired with a rolling-horizon projection, that no single strategy tested here covers alone; and coupling the reactor's thermal state to an explicit H2/CO2 mass balance for a fu</w:t>
+      </w:r>
+      <w:r>
+        <w:t>lly closed-loop chemical-yield model.</w:t>
       </w:r>
     </w:p>
     <w:sectPr>
@@ -1095,31 +1098,31 @@
       </w:rPr>
     </w:lvl>
   </w:abstractNum>
-  <w:num w:numId="1" w16cid:durableId="551188332">
+  <w:num w:numId="1" w16cid:durableId="229653244">
     <w:abstractNumId w:val="8"/>
   </w:num>
-  <w:num w:numId="2" w16cid:durableId="210117003">
+  <w:num w:numId="2" w16cid:durableId="1624532519">
     <w:abstractNumId w:val="6"/>
   </w:num>
-  <w:num w:numId="3" w16cid:durableId="39982743">
+  <w:num w:numId="3" w16cid:durableId="1004669934">
     <w:abstractNumId w:val="5"/>
   </w:num>
-  <w:num w:numId="4" w16cid:durableId="527915550">
+  <w:num w:numId="4" w16cid:durableId="1768387581">
     <w:abstractNumId w:val="4"/>
   </w:num>
-  <w:num w:numId="5" w16cid:durableId="602765864">
+  <w:num w:numId="5" w16cid:durableId="911500502">
     <w:abstractNumId w:val="7"/>
   </w:num>
-  <w:num w:numId="6" w16cid:durableId="58556340">
+  <w:num w:numId="6" w16cid:durableId="80490441">
     <w:abstractNumId w:val="3"/>
   </w:num>
-  <w:num w:numId="7" w16cid:durableId="832381894">
+  <w:num w:numId="7" w16cid:durableId="1327249546">
     <w:abstractNumId w:val="2"/>
   </w:num>
-  <w:num w:numId="8" w16cid:durableId="242760799">
+  <w:num w:numId="8" w16cid:durableId="1905872620">
     <w:abstractNumId w:val="1"/>
   </w:num>
-  <w:num w:numId="9" w16cid:durableId="1388845335">
+  <w:num w:numId="9" w16cid:durableId="1026254677">
     <w:abstractNumId w:val="0"/>
   </w:num>
 </w:numbering>

</xml_diff>

<commit_message>
Fix a real arithmetic error: 760 kWh does not exceed 800 kWh
Both the docx, the deck, and the original code comments claimed the
760 kWh single-night need "exceeds" the 800 kWh reserve -- backwards.
The actual point is that it uses up nearly all of it, leaving no
margin for a second night. Also tightened slide 3's decide()-interface
caption for accuracy.

Co-Authored-By: Claude Sonnet 5 <noreply@anthropic.com>
</commit_message>
<xml_diff>
--- a/SOTA_Commission_II_Submission.docx
+++ b/SOTA_Commission_II_Submission.docx
@@ -118,7 +118,7 @@
         </w:rPr>
         <w:lastRenderedPageBreak/>
         <w:drawing>
-          <wp:inline distT="0" distB="0" distL="0" distR="0" wp14:anchorId="6DCFB157" wp14:editId="53D34353">
+          <wp:inline distT="0" distB="0" distL="0" distR="0" wp14:anchorId="154B6CAF" wp14:editId="09954155">
             <wp:extent cx="5760720" cy="2099373"/>
             <wp:effectExtent l="0" t="0" r="0" b="0"/>
             <wp:docPr id="1" name="Picture 1"/>
@@ -892,10 +892,10 @@
         <w:t xml:space="preserve">What failed. </w:t>
       </w:r>
       <w:r>
-        <w:t>Two designs failed outright before the final architecture worked. Letting the electrolyzer/DAC draw partially from the battery above a reserve floor caused a catastrophic regression (300+ cold-starts a year, worse than doing nothing at all), because a single winter night's reactor-protection need (~760 kWh) already exceeds the largest reserve tested (800 kWh); the final design gives industrial loads PV-surplus only, with the reserve instead controlling a full on/off cutoff. Separately, the Temperature-Based</w:t>
+        <w:t>Two designs failed outright before the final architecture worked. Letting the electrolyzer/DAC draw partially from the battery above a reserve floor caused a catastrophic regression (300+ cold-starts a year, worse than doing nothing), because a single winter night's reactor-protection need (~760 kWh) already uses nearly all of the largest reserve tested (800 kWh), leaving no margin for a second night; the final design gives industrial loads PV-surplus only, with the reserve instead controlling a full on/off</w:t>
       </w:r>
       <w:r>
-        <w:t xml:space="preserve"> strategy's reserve formula was implemented backwards during development (larger reserve when the reactor was hottest, none when it was coldest); corrected, it still performs no better than doing nothing, since the reactor's own maintenance logic pins it at minimum temperature within about two hours of every night, leaving the formula almost nothing to compute by the time it would matter.</w:t>
+        <w:t xml:space="preserve"> cutoff. Separately, the Temperature-Based strategy's reserve formula was implemented backwards during development (larger reserve when the reactor was hottest, none when it was coldest); corrected, it still performs no better than doing nothing, since the reactor's own maintenance logic pins it at minimum temperature within about two hours of every night, leaving the formula almost nothing to compute by the time it would matter.</w:t>
       </w:r>
     </w:p>
     <w:p>
@@ -909,10 +909,7 @@
         <w:t xml:space="preserve">Next. </w:t>
       </w:r>
       <w:r>
-        <w:t>All 84 runs already cover imperfect forecasts, but as synthetic, independent Gaussian noise; replacing that with a live weather feed, whose errors are time-correlated and often biased in ways white noise isn't, would test whether the same strategy rankings hold. Also worth testing: hybrid designs, for instance a thermodynamic trigger paired with a rolling-horizon projection, that no single strategy tested here covers alone; and coupling the reactor's thermal state to an explicit H2/CO2 mass balance for a fu</w:t>
-      </w:r>
-      <w:r>
-        <w:t>lly closed-loop chemical-yield model.</w:t>
+        <w:t>All 84 runs already cover imperfect forecasts, but as synthetic Gaussian noise; a live weather feed's time-correlated, biased errors would be a stronger test of whether the same rankings hold. Also worth testing: hybrid designs no single strategy tested here covers alone, such as a thermodynamic trigger paired with a rolling-horizon projection; and coupling the reactor's thermal state to an explicit H2/CO2 mass balance for a fully closed-loop chemical-yield model.</w:t>
       </w:r>
     </w:p>
     <w:sectPr>
@@ -1098,31 +1095,31 @@
       </w:rPr>
     </w:lvl>
   </w:abstractNum>
-  <w:num w:numId="1" w16cid:durableId="229653244">
+  <w:num w:numId="1" w16cid:durableId="2069453474">
     <w:abstractNumId w:val="8"/>
   </w:num>
-  <w:num w:numId="2" w16cid:durableId="1624532519">
+  <w:num w:numId="2" w16cid:durableId="1527672573">
     <w:abstractNumId w:val="6"/>
   </w:num>
-  <w:num w:numId="3" w16cid:durableId="1004669934">
+  <w:num w:numId="3" w16cid:durableId="145903034">
     <w:abstractNumId w:val="5"/>
   </w:num>
-  <w:num w:numId="4" w16cid:durableId="1768387581">
+  <w:num w:numId="4" w16cid:durableId="1557888960">
     <w:abstractNumId w:val="4"/>
   </w:num>
-  <w:num w:numId="5" w16cid:durableId="911500502">
+  <w:num w:numId="5" w16cid:durableId="1940405951">
     <w:abstractNumId w:val="7"/>
   </w:num>
-  <w:num w:numId="6" w16cid:durableId="80490441">
+  <w:num w:numId="6" w16cid:durableId="1058935470">
     <w:abstractNumId w:val="3"/>
   </w:num>
-  <w:num w:numId="7" w16cid:durableId="1327249546">
+  <w:num w:numId="7" w16cid:durableId="706955924">
     <w:abstractNumId w:val="2"/>
   </w:num>
-  <w:num w:numId="8" w16cid:durableId="1905872620">
+  <w:num w:numId="8" w16cid:durableId="1222247684">
     <w:abstractNumId w:val="1"/>
   </w:num>
-  <w:num w:numId="9" w16cid:durableId="1026254677">
+  <w:num w:numId="9" w16cid:durableId="719593917">
     <w:abstractNumId w:val="0"/>
   </w:num>
 </w:numbering>

</xml_diff>